<commit_message>
Restructure facility navigation and add pages for infrastructure details
Updates the facilities menu structure, adds new department infrastructure pages, and integrates supporting documentation.

Replit-Commit-Author: Agent
Replit-Commit-Session-Id: a2e8a19f-0077-4042-bc04-1e135638b565
Replit-Commit-Screenshot-Url: https://storage.googleapis.com/screenshot-production-us-central1/eb7ffae8-4aed-46f4-87ed-de0bbea27fa2/57b313a0-ced9-4386-84db-a265639e2f17.jpg
</commit_message>
<xml_diff>
--- a/attached_assets/CE.docx
+++ b/attached_assets/CE.docx
@@ -16,13 +16,26 @@
           <w:bCs/>
           <w:lang w:val="en-IN"/>
         </w:rPr>
-        <w:t>CIVIL ENGINEERING</w:t>
+        <w:t>CIVIL DEPARTMENT</w:t>
+      </w:r>
+    </w:p>
+    <w:p>
+      <w:pPr>
+        <w:rPr>
+          <w:lang w:val="en-IN"/>
+        </w:rPr>
+      </w:pPr>
+      <w:r>
+        <w:rPr>
+          <w:lang w:val="en-IN"/>
+        </w:rPr>
+        <w:t>Adequate number of class rooms are available for conducting classes, class rooms are specious enough to accommodate students and are well furnished and ensure proper circulation of fresh air and light. The dimensions and other facilities of the classrooms are maintained as per the AICTE norms classrooms are kept clean and hygienic. An adequate number of class rooms is available for conducting lectures. No. of classrooms = 3.</w:t>
       </w:r>
     </w:p>
     <w:tbl>
       <w:tblPr>
-        <w:tblW w:w="10747" w:type="dxa"/>
-        <w:tblInd w:w="-1215" w:type="dxa"/>
+        <w:tblW w:w="5000" w:type="pct"/>
+        <w:shd w:val="clear" w:color="auto" w:fill="FFFFFF"/>
         <w:tblCellMar>
           <w:left w:w="0" w:type="dxa"/>
           <w:right w:w="0" w:type="dxa"/>
@@ -30,18 +43,22 @@
         <w:tblLook w:val="04A0" w:firstRow="1" w:lastRow="0" w:firstColumn="1" w:lastColumn="0" w:noHBand="0" w:noVBand="1"/>
       </w:tblPr>
       <w:tblGrid>
-        <w:gridCol w:w="3190"/>
-        <w:gridCol w:w="3244"/>
-        <w:gridCol w:w="4313"/>
+        <w:gridCol w:w="2251"/>
+        <w:gridCol w:w="1485"/>
+        <w:gridCol w:w="1943"/>
+        <w:gridCol w:w="3921"/>
       </w:tblGrid>
       <w:tr>
-        <w:trPr>
-          <w:trHeight w:val="1816"/>
-        </w:trPr>
         <w:tc>
           <w:tcPr>
-            <w:tcW w:w="0" w:type="auto"/>
-            <w:shd w:val="clear" w:color="auto" w:fill="F0F0F0"/>
+            <w:tcW w:w="1172" w:type="pct"/>
+            <w:tcBorders>
+              <w:top w:val="single" w:sz="6" w:space="0" w:color="auto"/>
+              <w:left w:val="single" w:sz="6" w:space="0" w:color="auto"/>
+              <w:bottom w:val="single" w:sz="6" w:space="0" w:color="auto"/>
+              <w:right w:val="single" w:sz="6" w:space="0" w:color="auto"/>
+            </w:tcBorders>
+            <w:shd w:val="clear" w:color="auto" w:fill="FFFFFF"/>
             <w:tcMar>
               <w:top w:w="120" w:type="dxa"/>
               <w:left w:w="120" w:type="dxa"/>
@@ -59,30 +76,33 @@
             </w:pPr>
             <w:r>
               <w:rPr>
-                <w:lang w:val="en-IN"/>
-              </w:rPr>
-              <w:t>PROFESSIONAL</w:t>
-            </w:r>
-            <w:r>
-              <w:rPr>
+                <w:b/>
+                <w:bCs/>
+                <w:lang w:val="en-IN"/>
+              </w:rPr>
+              <w:t>Room</w:t>
+            </w:r>
+            <w:r>
+              <w:rPr>
+                <w:b/>
+                <w:bCs/>
                 <w:lang w:val="en-IN"/>
               </w:rPr>
               <w:br/>
-              <w:t>SOCIETIES</w:t>
-            </w:r>
-            <w:r>
-              <w:rPr>
-                <w:lang w:val="en-IN"/>
-              </w:rPr>
-              <w:br/>
-              <w:t>REGISTERED</w:t>
+              <w:t>Description</w:t>
             </w:r>
           </w:p>
         </w:tc>
         <w:tc>
           <w:tcPr>
-            <w:tcW w:w="0" w:type="auto"/>
-            <w:shd w:val="clear" w:color="auto" w:fill="F0F0F0"/>
+            <w:tcW w:w="773" w:type="pct"/>
+            <w:tcBorders>
+              <w:top w:val="single" w:sz="6" w:space="0" w:color="auto"/>
+              <w:left w:val="single" w:sz="6" w:space="0" w:color="auto"/>
+              <w:bottom w:val="single" w:sz="6" w:space="0" w:color="auto"/>
+              <w:right w:val="single" w:sz="6" w:space="0" w:color="auto"/>
+            </w:tcBorders>
+            <w:shd w:val="clear" w:color="auto" w:fill="FFFFFF"/>
             <w:tcMar>
               <w:top w:w="120" w:type="dxa"/>
               <w:left w:w="120" w:type="dxa"/>
@@ -100,16 +120,68 @@
             </w:pPr>
             <w:r>
               <w:rPr>
-                <w:lang w:val="en-IN"/>
-              </w:rPr>
-              <w:t>MEMBER</w:t>
+                <w:b/>
+                <w:bCs/>
+                <w:lang w:val="en-IN"/>
+              </w:rPr>
+              <w:t>Carpet</w:t>
+            </w:r>
+            <w:r>
+              <w:rPr>
+                <w:b/>
+                <w:bCs/>
+                <w:lang w:val="en-IN"/>
+              </w:rPr>
+              <w:br/>
+              <w:t>Area</w:t>
+            </w:r>
+            <w:r>
+              <w:rPr>
+                <w:b/>
+                <w:bCs/>
+                <w:lang w:val="en-IN"/>
+              </w:rPr>
+              <w:br/>
+              <w:t>in</w:t>
+            </w:r>
+            <w:r>
+              <w:rPr>
+                <w:b/>
+                <w:bCs/>
+                <w:lang w:val="en-IN"/>
+              </w:rPr>
+              <w:br/>
+            </w:r>
+            <w:proofErr w:type="spellStart"/>
+            <w:r>
+              <w:rPr>
+                <w:b/>
+                <w:bCs/>
+                <w:lang w:val="en-IN"/>
+              </w:rPr>
+              <w:t>Sq.m</w:t>
+            </w:r>
+            <w:proofErr w:type="spellEnd"/>
+            <w:r>
+              <w:rPr>
+                <w:b/>
+                <w:bCs/>
+                <w:lang w:val="en-IN"/>
+              </w:rPr>
+              <w:t>.</w:t>
             </w:r>
           </w:p>
         </w:tc>
         <w:tc>
           <w:tcPr>
-            <w:tcW w:w="0" w:type="auto"/>
-            <w:shd w:val="clear" w:color="auto" w:fill="F0F0F0"/>
+            <w:tcW w:w="1012" w:type="pct"/>
+            <w:tcBorders>
+              <w:top w:val="single" w:sz="6" w:space="0" w:color="auto"/>
+              <w:left w:val="single" w:sz="6" w:space="0" w:color="auto"/>
+              <w:bottom w:val="single" w:sz="6" w:space="0" w:color="auto"/>
+              <w:right w:val="single" w:sz="6" w:space="0" w:color="auto"/>
+            </w:tcBorders>
+            <w:shd w:val="clear" w:color="auto" w:fill="FFFFFF"/>
             <w:tcMar>
               <w:top w:w="120" w:type="dxa"/>
               <w:left w:w="120" w:type="dxa"/>
@@ -127,20 +199,24 @@
             </w:pPr>
             <w:r>
               <w:rPr>
-                <w:lang w:val="en-IN"/>
-              </w:rPr>
-              <w:t>EVENTS</w:t>
+                <w:b/>
+                <w:bCs/>
+                <w:lang w:val="en-IN"/>
+              </w:rPr>
+              <w:t>USAGE</w:t>
             </w:r>
           </w:p>
         </w:tc>
-      </w:tr>
-      <w:tr>
-        <w:trPr>
-          <w:trHeight w:val="1816"/>
-        </w:trPr>
         <w:tc>
           <w:tcPr>
-            <w:tcW w:w="0" w:type="auto"/>
+            <w:tcW w:w="2042" w:type="pct"/>
+            <w:tcBorders>
+              <w:top w:val="single" w:sz="6" w:space="0" w:color="auto"/>
+              <w:left w:val="single" w:sz="6" w:space="0" w:color="auto"/>
+              <w:bottom w:val="single" w:sz="6" w:space="0" w:color="auto"/>
+              <w:right w:val="single" w:sz="6" w:space="0" w:color="auto"/>
+            </w:tcBorders>
+            <w:shd w:val="clear" w:color="auto" w:fill="FFFFFF"/>
             <w:tcMar>
               <w:top w:w="120" w:type="dxa"/>
               <w:left w:w="120" w:type="dxa"/>
@@ -158,29 +234,26 @@
             </w:pPr>
             <w:r>
               <w:rPr>
-                <w:lang w:val="en-IN"/>
-              </w:rPr>
-              <w:t>THE INSTITUTE OF</w:t>
-            </w:r>
-            <w:r>
-              <w:rPr>
-                <w:lang w:val="en-IN"/>
-              </w:rPr>
-              <w:br/>
-              <w:t>ENGINEERING</w:t>
-            </w:r>
-            <w:r>
-              <w:rPr>
-                <w:lang w:val="en-IN"/>
-              </w:rPr>
-              <w:br/>
-              <w:t>KOLKATA</w:t>
+                <w:b/>
+                <w:bCs/>
+                <w:lang w:val="en-IN"/>
+              </w:rPr>
+              <w:t>Rooms Equipped with</w:t>
             </w:r>
           </w:p>
         </w:tc>
+      </w:tr>
+      <w:tr>
         <w:tc>
           <w:tcPr>
-            <w:tcW w:w="0" w:type="auto"/>
+            <w:tcW w:w="1172" w:type="pct"/>
+            <w:tcBorders>
+              <w:top w:val="single" w:sz="6" w:space="0" w:color="auto"/>
+              <w:left w:val="single" w:sz="6" w:space="0" w:color="auto"/>
+              <w:bottom w:val="single" w:sz="6" w:space="0" w:color="auto"/>
+              <w:right w:val="single" w:sz="6" w:space="0" w:color="auto"/>
+            </w:tcBorders>
+            <w:shd w:val="clear" w:color="auto" w:fill="FFFFFF"/>
             <w:tcMar>
               <w:top w:w="120" w:type="dxa"/>
               <w:left w:w="120" w:type="dxa"/>
@@ -200,13 +273,27 @@
               <w:rPr>
                 <w:lang w:val="en-IN"/>
               </w:rPr>
-              <w:t>ROOPESH KUMAR B</w:t>
+              <w:t>Class Room</w:t>
+            </w:r>
+            <w:r>
+              <w:rPr>
+                <w:lang w:val="en-IN"/>
+              </w:rPr>
+              <w:br/>
+              <w:t>CE-211</w:t>
             </w:r>
           </w:p>
         </w:tc>
         <w:tc>
           <w:tcPr>
-            <w:tcW w:w="0" w:type="auto"/>
+            <w:tcW w:w="773" w:type="pct"/>
+            <w:tcBorders>
+              <w:top w:val="single" w:sz="6" w:space="0" w:color="auto"/>
+              <w:left w:val="single" w:sz="6" w:space="0" w:color="auto"/>
+              <w:bottom w:val="single" w:sz="6" w:space="0" w:color="auto"/>
+              <w:right w:val="single" w:sz="6" w:space="0" w:color="auto"/>
+            </w:tcBorders>
+            <w:shd w:val="clear" w:color="auto" w:fill="FFFFFF"/>
             <w:tcMar>
               <w:top w:w="120" w:type="dxa"/>
               <w:left w:w="120" w:type="dxa"/>
@@ -226,19 +313,20 @@
               <w:rPr>
                 <w:lang w:val="en-IN"/>
               </w:rPr>
-              <w:t>–</w:t>
+              <w:t>41.8</w:t>
             </w:r>
           </w:p>
         </w:tc>
-      </w:tr>
-      <w:tr>
-        <w:trPr>
-          <w:trHeight w:val="1816"/>
-        </w:trPr>
         <w:tc>
           <w:tcPr>
-            <w:tcW w:w="0" w:type="auto"/>
-            <w:shd w:val="clear" w:color="auto" w:fill="F0F0F0"/>
+            <w:tcW w:w="1012" w:type="pct"/>
+            <w:tcBorders>
+              <w:top w:val="single" w:sz="6" w:space="0" w:color="auto"/>
+              <w:left w:val="single" w:sz="6" w:space="0" w:color="auto"/>
+              <w:bottom w:val="single" w:sz="6" w:space="0" w:color="auto"/>
+              <w:right w:val="single" w:sz="6" w:space="0" w:color="auto"/>
+            </w:tcBorders>
+            <w:shd w:val="clear" w:color="auto" w:fill="FFFFFF"/>
             <w:tcMar>
               <w:top w:w="120" w:type="dxa"/>
               <w:left w:w="120" w:type="dxa"/>
@@ -258,28 +346,41 @@
               <w:rPr>
                 <w:lang w:val="en-IN"/>
               </w:rPr>
-              <w:t>INDIAN SOCIETY OF</w:t>
+              <w:t>Class</w:t>
             </w:r>
             <w:r>
               <w:rPr>
                 <w:lang w:val="en-IN"/>
               </w:rPr>
               <w:br/>
-              <w:t>TECHNICAL</w:t>
+              <w:t>Room For</w:t>
             </w:r>
             <w:r>
               <w:rPr>
                 <w:lang w:val="en-IN"/>
               </w:rPr>
               <w:br/>
-              <w:t>EDUCATION</w:t>
+              <w:t>3rd Yr</w:t>
+            </w:r>
+            <w:r>
+              <w:rPr>
+                <w:lang w:val="en-IN"/>
+              </w:rPr>
+              <w:br/>
+              <w:t>Student</w:t>
             </w:r>
           </w:p>
         </w:tc>
         <w:tc>
           <w:tcPr>
-            <w:tcW w:w="0" w:type="auto"/>
-            <w:shd w:val="clear" w:color="auto" w:fill="F0F0F0"/>
+            <w:tcW w:w="2042" w:type="pct"/>
+            <w:tcBorders>
+              <w:top w:val="single" w:sz="6" w:space="0" w:color="auto"/>
+              <w:left w:val="single" w:sz="6" w:space="0" w:color="auto"/>
+              <w:bottom w:val="single" w:sz="6" w:space="0" w:color="auto"/>
+              <w:right w:val="single" w:sz="6" w:space="0" w:color="auto"/>
+            </w:tcBorders>
+            <w:shd w:val="clear" w:color="auto" w:fill="FFFFFF"/>
             <w:tcMar>
               <w:top w:w="120" w:type="dxa"/>
               <w:left w:w="120" w:type="dxa"/>
@@ -299,29 +400,36 @@
               <w:rPr>
                 <w:lang w:val="en-IN"/>
               </w:rPr>
-              <w:t xml:space="preserve">JSS </w:t>
-            </w:r>
-            <w:proofErr w:type="gramStart"/>
-            <w:r>
-              <w:rPr>
-                <w:lang w:val="en-IN"/>
-              </w:rPr>
-              <w:t>POLYTECHNIC ,</w:t>
-            </w:r>
-            <w:proofErr w:type="gramEnd"/>
+              <w:t>Black Board,</w:t>
+            </w:r>
             <w:r>
               <w:rPr>
                 <w:lang w:val="en-IN"/>
               </w:rPr>
               <w:br/>
-              <w:t>MYSURU</w:t>
+              <w:t>Chalk,</w:t>
+            </w:r>
+            <w:r>
+              <w:rPr>
+                <w:lang w:val="en-IN"/>
+              </w:rPr>
+              <w:br/>
+              <w:t>Duster, Notice Board</w:t>
             </w:r>
           </w:p>
         </w:tc>
+      </w:tr>
+      <w:tr>
         <w:tc>
           <w:tcPr>
-            <w:tcW w:w="0" w:type="auto"/>
-            <w:shd w:val="clear" w:color="auto" w:fill="F0F0F0"/>
+            <w:tcW w:w="1172" w:type="pct"/>
+            <w:tcBorders>
+              <w:top w:val="single" w:sz="6" w:space="0" w:color="auto"/>
+              <w:left w:val="single" w:sz="6" w:space="0" w:color="auto"/>
+              <w:bottom w:val="single" w:sz="6" w:space="0" w:color="auto"/>
+              <w:right w:val="single" w:sz="6" w:space="0" w:color="auto"/>
+            </w:tcBorders>
+            <w:shd w:val="clear" w:color="auto" w:fill="FFFFFF"/>
             <w:tcMar>
               <w:top w:w="120" w:type="dxa"/>
               <w:left w:w="120" w:type="dxa"/>
@@ -341,26 +449,923 @@
               <w:rPr>
                 <w:lang w:val="en-IN"/>
               </w:rPr>
-              <w:t>NATIONAL SEMINAR ON</w:t>
+              <w:t>Class</w:t>
             </w:r>
             <w:r>
               <w:rPr>
                 <w:lang w:val="en-IN"/>
               </w:rPr>
               <w:br/>
-              <w:t>EMERGING TECHNOLOGIES</w:t>
+              <w:t>Room</w:t>
             </w:r>
             <w:r>
               <w:rPr>
                 <w:lang w:val="en-IN"/>
               </w:rPr>
               <w:br/>
-              <w:t>IN ENGINEERING FIELD</w:t>
-            </w:r>
+              <w:t>CE-007</w:t>
+            </w:r>
+          </w:p>
+        </w:tc>
+        <w:tc>
+          <w:tcPr>
+            <w:tcW w:w="773" w:type="pct"/>
+            <w:tcBorders>
+              <w:top w:val="single" w:sz="6" w:space="0" w:color="auto"/>
+              <w:left w:val="single" w:sz="6" w:space="0" w:color="auto"/>
+              <w:bottom w:val="single" w:sz="6" w:space="0" w:color="auto"/>
+              <w:right w:val="single" w:sz="6" w:space="0" w:color="auto"/>
+            </w:tcBorders>
+            <w:shd w:val="clear" w:color="auto" w:fill="FFFFFF"/>
+            <w:tcMar>
+              <w:top w:w="120" w:type="dxa"/>
+              <w:left w:w="120" w:type="dxa"/>
+              <w:bottom w:w="120" w:type="dxa"/>
+              <w:right w:w="120" w:type="dxa"/>
+            </w:tcMar>
+            <w:vAlign w:val="bottom"/>
+            <w:hideMark/>
+          </w:tcPr>
+          <w:p>
+            <w:pPr>
+              <w:rPr>
+                <w:lang w:val="en-IN"/>
+              </w:rPr>
+            </w:pPr>
+            <w:r>
+              <w:rPr>
+                <w:lang w:val="en-IN"/>
+              </w:rPr>
+              <w:t>41.8</w:t>
+            </w:r>
+          </w:p>
+        </w:tc>
+        <w:tc>
+          <w:tcPr>
+            <w:tcW w:w="1012" w:type="pct"/>
+            <w:tcBorders>
+              <w:top w:val="single" w:sz="6" w:space="0" w:color="auto"/>
+              <w:left w:val="single" w:sz="6" w:space="0" w:color="auto"/>
+              <w:bottom w:val="single" w:sz="6" w:space="0" w:color="auto"/>
+              <w:right w:val="single" w:sz="6" w:space="0" w:color="auto"/>
+            </w:tcBorders>
+            <w:shd w:val="clear" w:color="auto" w:fill="FFFFFF"/>
+            <w:tcMar>
+              <w:top w:w="120" w:type="dxa"/>
+              <w:left w:w="120" w:type="dxa"/>
+              <w:bottom w:w="120" w:type="dxa"/>
+              <w:right w:w="120" w:type="dxa"/>
+            </w:tcMar>
+            <w:vAlign w:val="bottom"/>
+            <w:hideMark/>
+          </w:tcPr>
+          <w:p>
+            <w:pPr>
+              <w:rPr>
+                <w:lang w:val="en-IN"/>
+              </w:rPr>
+            </w:pPr>
+            <w:r>
+              <w:rPr>
+                <w:lang w:val="en-IN"/>
+              </w:rPr>
+              <w:t>Class</w:t>
+            </w:r>
+            <w:r>
+              <w:rPr>
+                <w:lang w:val="en-IN"/>
+              </w:rPr>
+              <w:br/>
+              <w:t>Room For</w:t>
+            </w:r>
+            <w:r>
+              <w:rPr>
+                <w:lang w:val="en-IN"/>
+              </w:rPr>
+              <w:br/>
+              <w:t>2nd Yr</w:t>
+            </w:r>
+            <w:r>
+              <w:rPr>
+                <w:lang w:val="en-IN"/>
+              </w:rPr>
+              <w:br/>
+              <w:t>Student</w:t>
+            </w:r>
+          </w:p>
+        </w:tc>
+        <w:tc>
+          <w:tcPr>
+            <w:tcW w:w="2042" w:type="pct"/>
+            <w:tcBorders>
+              <w:top w:val="single" w:sz="6" w:space="0" w:color="auto"/>
+              <w:left w:val="single" w:sz="6" w:space="0" w:color="auto"/>
+              <w:bottom w:val="single" w:sz="6" w:space="0" w:color="auto"/>
+              <w:right w:val="single" w:sz="6" w:space="0" w:color="auto"/>
+            </w:tcBorders>
+            <w:shd w:val="clear" w:color="auto" w:fill="FFFFFF"/>
+            <w:tcMar>
+              <w:top w:w="120" w:type="dxa"/>
+              <w:left w:w="120" w:type="dxa"/>
+              <w:bottom w:w="120" w:type="dxa"/>
+              <w:right w:w="120" w:type="dxa"/>
+            </w:tcMar>
+            <w:vAlign w:val="bottom"/>
+            <w:hideMark/>
+          </w:tcPr>
+          <w:p>
+            <w:pPr>
+              <w:rPr>
+                <w:lang w:val="en-IN"/>
+              </w:rPr>
+            </w:pPr>
+            <w:r>
+              <w:rPr>
+                <w:lang w:val="en-IN"/>
+              </w:rPr>
+              <w:t>Black Board,</w:t>
+            </w:r>
+            <w:r>
+              <w:rPr>
+                <w:lang w:val="en-IN"/>
+              </w:rPr>
+              <w:br/>
+              <w:t>Chalk,</w:t>
+            </w:r>
+            <w:r>
+              <w:rPr>
+                <w:lang w:val="en-IN"/>
+              </w:rPr>
+              <w:br/>
+              <w:t>Duster, Notice Board</w:t>
+            </w:r>
+          </w:p>
+        </w:tc>
+      </w:tr>
+      <w:tr>
+        <w:tc>
+          <w:tcPr>
+            <w:tcW w:w="1172" w:type="pct"/>
+            <w:tcBorders>
+              <w:top w:val="single" w:sz="6" w:space="0" w:color="auto"/>
+              <w:left w:val="single" w:sz="6" w:space="0" w:color="auto"/>
+              <w:bottom w:val="single" w:sz="6" w:space="0" w:color="auto"/>
+              <w:right w:val="single" w:sz="6" w:space="0" w:color="auto"/>
+            </w:tcBorders>
+            <w:shd w:val="clear" w:color="auto" w:fill="FFFFFF"/>
+            <w:tcMar>
+              <w:top w:w="120" w:type="dxa"/>
+              <w:left w:w="120" w:type="dxa"/>
+              <w:bottom w:w="120" w:type="dxa"/>
+              <w:right w:w="120" w:type="dxa"/>
+            </w:tcMar>
+            <w:vAlign w:val="bottom"/>
+            <w:hideMark/>
+          </w:tcPr>
+          <w:p>
+            <w:pPr>
+              <w:rPr>
+                <w:lang w:val="en-IN"/>
+              </w:rPr>
+            </w:pPr>
+            <w:r>
+              <w:rPr>
+                <w:lang w:val="en-IN"/>
+              </w:rPr>
+              <w:t>Class Room</w:t>
+            </w:r>
+            <w:r>
+              <w:rPr>
+                <w:lang w:val="en-IN"/>
+              </w:rPr>
+              <w:br/>
+              <w:t>CE-P101</w:t>
+            </w:r>
+          </w:p>
+        </w:tc>
+        <w:tc>
+          <w:tcPr>
+            <w:tcW w:w="773" w:type="pct"/>
+            <w:tcBorders>
+              <w:top w:val="single" w:sz="6" w:space="0" w:color="auto"/>
+              <w:left w:val="single" w:sz="6" w:space="0" w:color="auto"/>
+              <w:bottom w:val="single" w:sz="6" w:space="0" w:color="auto"/>
+              <w:right w:val="single" w:sz="6" w:space="0" w:color="auto"/>
+            </w:tcBorders>
+            <w:shd w:val="clear" w:color="auto" w:fill="FFFFFF"/>
+            <w:tcMar>
+              <w:top w:w="120" w:type="dxa"/>
+              <w:left w:w="120" w:type="dxa"/>
+              <w:bottom w:w="120" w:type="dxa"/>
+              <w:right w:w="120" w:type="dxa"/>
+            </w:tcMar>
+            <w:vAlign w:val="bottom"/>
+            <w:hideMark/>
+          </w:tcPr>
+          <w:p>
+            <w:pPr>
+              <w:rPr>
+                <w:lang w:val="en-IN"/>
+              </w:rPr>
+            </w:pPr>
+            <w:r>
+              <w:rPr>
+                <w:lang w:val="en-IN"/>
+              </w:rPr>
+              <w:t>91.6</w:t>
+            </w:r>
+          </w:p>
+        </w:tc>
+        <w:tc>
+          <w:tcPr>
+            <w:tcW w:w="1012" w:type="pct"/>
+            <w:tcBorders>
+              <w:top w:val="single" w:sz="6" w:space="0" w:color="auto"/>
+              <w:left w:val="single" w:sz="6" w:space="0" w:color="auto"/>
+              <w:bottom w:val="single" w:sz="6" w:space="0" w:color="auto"/>
+              <w:right w:val="single" w:sz="6" w:space="0" w:color="auto"/>
+            </w:tcBorders>
+            <w:shd w:val="clear" w:color="auto" w:fill="FFFFFF"/>
+            <w:tcMar>
+              <w:top w:w="120" w:type="dxa"/>
+              <w:left w:w="120" w:type="dxa"/>
+              <w:bottom w:w="120" w:type="dxa"/>
+              <w:right w:w="120" w:type="dxa"/>
+            </w:tcMar>
+            <w:vAlign w:val="bottom"/>
+            <w:hideMark/>
+          </w:tcPr>
+          <w:p>
+            <w:pPr>
+              <w:rPr>
+                <w:lang w:val="en-IN"/>
+              </w:rPr>
+            </w:pPr>
+            <w:r>
+              <w:rPr>
+                <w:lang w:val="en-IN"/>
+              </w:rPr>
+              <w:t>Class</w:t>
+            </w:r>
+            <w:r>
+              <w:rPr>
+                <w:lang w:val="en-IN"/>
+              </w:rPr>
+              <w:br/>
+              <w:t>Room</w:t>
+            </w:r>
+            <w:r>
+              <w:rPr>
+                <w:lang w:val="en-IN"/>
+              </w:rPr>
+              <w:br/>
+              <w:t>For 1</w:t>
+            </w:r>
+            <w:r>
+              <w:rPr>
+                <w:lang w:val="en-IN"/>
+              </w:rPr>
+              <w:br/>
+              <w:t>ST</w:t>
+            </w:r>
+            <w:r>
+              <w:rPr>
+                <w:lang w:val="en-IN"/>
+              </w:rPr>
+              <w:br/>
+              <w:t>Yr</w:t>
+            </w:r>
+            <w:r>
+              <w:rPr>
+                <w:lang w:val="en-IN"/>
+              </w:rPr>
+              <w:br/>
+              <w:t>Students</w:t>
+            </w:r>
+          </w:p>
+        </w:tc>
+        <w:tc>
+          <w:tcPr>
+            <w:tcW w:w="2042" w:type="pct"/>
+            <w:tcBorders>
+              <w:top w:val="single" w:sz="6" w:space="0" w:color="auto"/>
+              <w:left w:val="single" w:sz="6" w:space="0" w:color="auto"/>
+              <w:bottom w:val="single" w:sz="6" w:space="0" w:color="auto"/>
+              <w:right w:val="single" w:sz="6" w:space="0" w:color="auto"/>
+            </w:tcBorders>
+            <w:shd w:val="clear" w:color="auto" w:fill="FFFFFF"/>
+            <w:tcMar>
+              <w:top w:w="120" w:type="dxa"/>
+              <w:left w:w="120" w:type="dxa"/>
+              <w:bottom w:w="120" w:type="dxa"/>
+              <w:right w:w="120" w:type="dxa"/>
+            </w:tcMar>
+            <w:vAlign w:val="bottom"/>
+            <w:hideMark/>
+          </w:tcPr>
+          <w:p>
+            <w:pPr>
+              <w:rPr>
+                <w:lang w:val="en-IN"/>
+              </w:rPr>
+            </w:pPr>
+            <w:r>
+              <w:rPr>
+                <w:lang w:val="en-IN"/>
+              </w:rPr>
+              <w:t>Black Board,</w:t>
+            </w:r>
+            <w:r>
+              <w:rPr>
+                <w:lang w:val="en-IN"/>
+              </w:rPr>
+              <w:br/>
+              <w:t>Chalk,</w:t>
+            </w:r>
+            <w:r>
+              <w:rPr>
+                <w:lang w:val="en-IN"/>
+              </w:rPr>
+              <w:br/>
+            </w:r>
+            <w:proofErr w:type="spellStart"/>
+            <w:proofErr w:type="gramStart"/>
+            <w:r>
+              <w:rPr>
+                <w:lang w:val="en-IN"/>
+              </w:rPr>
+              <w:t>Duster,NoticeBoard</w:t>
+            </w:r>
+            <w:proofErr w:type="spellEnd"/>
+            <w:proofErr w:type="gramEnd"/>
           </w:p>
         </w:tc>
       </w:tr>
     </w:tbl>
+    <w:p>
+      <w:pPr>
+        <w:rPr>
+          <w:lang w:val="en-IN"/>
+        </w:rPr>
+      </w:pPr>
+      <w:r>
+        <w:rPr>
+          <w:b/>
+          <w:bCs/>
+          <w:lang w:val="en-IN"/>
+        </w:rPr>
+        <w:t>Adequacy</w:t>
+      </w:r>
+    </w:p>
+    <w:p>
+      <w:pPr>
+        <w:rPr>
+          <w:lang w:val="en-IN"/>
+        </w:rPr>
+      </w:pPr>
+      <w:r>
+        <w:rPr>
+          <w:lang w:val="en-IN"/>
+        </w:rPr>
+        <w:t>The department has well-established laboratories that excel in enriching the practical knowledge of students with creative engineering experiments.</w:t>
+      </w:r>
+    </w:p>
+    <w:p>
+      <w:pPr>
+        <w:numPr>
+          <w:ilvl w:val="0"/>
+          <w:numId w:val="1"/>
+        </w:numPr>
+        <w:rPr>
+          <w:lang w:val="en-IN"/>
+        </w:rPr>
+      </w:pPr>
+      <w:r>
+        <w:rPr>
+          <w:lang w:val="en-IN"/>
+        </w:rPr>
+        <w:t>Survey lab</w:t>
+      </w:r>
+    </w:p>
+    <w:p>
+      <w:pPr>
+        <w:numPr>
+          <w:ilvl w:val="0"/>
+          <w:numId w:val="1"/>
+        </w:numPr>
+        <w:rPr>
+          <w:lang w:val="en-IN"/>
+        </w:rPr>
+      </w:pPr>
+      <w:r>
+        <w:rPr>
+          <w:lang w:val="en-IN"/>
+        </w:rPr>
+        <w:t>Material testing lab</w:t>
+      </w:r>
+    </w:p>
+    <w:p>
+      <w:pPr>
+        <w:numPr>
+          <w:ilvl w:val="0"/>
+          <w:numId w:val="1"/>
+        </w:numPr>
+        <w:rPr>
+          <w:lang w:val="en-IN"/>
+        </w:rPr>
+      </w:pPr>
+      <w:r>
+        <w:rPr>
+          <w:lang w:val="en-IN"/>
+        </w:rPr>
+        <w:t>Computer lab</w:t>
+      </w:r>
+    </w:p>
+    <w:p>
+      <w:pPr>
+        <w:numPr>
+          <w:ilvl w:val="0"/>
+          <w:numId w:val="1"/>
+        </w:numPr>
+        <w:rPr>
+          <w:lang w:val="en-IN"/>
+        </w:rPr>
+      </w:pPr>
+      <w:r>
+        <w:rPr>
+          <w:lang w:val="en-IN"/>
+        </w:rPr>
+        <w:t>Construction lab</w:t>
+      </w:r>
+    </w:p>
+    <w:p>
+      <w:pPr>
+        <w:numPr>
+          <w:ilvl w:val="0"/>
+          <w:numId w:val="1"/>
+        </w:numPr>
+        <w:rPr>
+          <w:lang w:val="en-IN"/>
+        </w:rPr>
+      </w:pPr>
+      <w:r>
+        <w:rPr>
+          <w:lang w:val="en-IN"/>
+        </w:rPr>
+        <w:lastRenderedPageBreak/>
+        <w:t>Size of the Laboratories is adequate accommodate the students.</w:t>
+      </w:r>
+    </w:p>
+    <w:p>
+      <w:pPr>
+        <w:numPr>
+          <w:ilvl w:val="0"/>
+          <w:numId w:val="1"/>
+        </w:numPr>
+        <w:rPr>
+          <w:lang w:val="en-IN"/>
+        </w:rPr>
+      </w:pPr>
+      <w:r>
+        <w:rPr>
+          <w:lang w:val="en-IN"/>
+        </w:rPr>
+        <w:t>All laboratories are well furnished.</w:t>
+      </w:r>
+    </w:p>
+    <w:p>
+      <w:pPr>
+        <w:numPr>
+          <w:ilvl w:val="0"/>
+          <w:numId w:val="1"/>
+        </w:numPr>
+        <w:rPr>
+          <w:lang w:val="en-IN"/>
+        </w:rPr>
+      </w:pPr>
+      <w:r>
+        <w:rPr>
+          <w:lang w:val="en-IN"/>
+        </w:rPr>
+        <w:t>All the doors are sufficiently wide and available in adequate numbers.</w:t>
+      </w:r>
+    </w:p>
+    <w:p>
+      <w:pPr>
+        <w:numPr>
+          <w:ilvl w:val="0"/>
+          <w:numId w:val="1"/>
+        </w:numPr>
+        <w:rPr>
+          <w:lang w:val="en-IN"/>
+        </w:rPr>
+      </w:pPr>
+      <w:r>
+        <w:rPr>
+          <w:lang w:val="en-IN"/>
+        </w:rPr>
+        <w:t>The laboratory is kept clean and hygienic.</w:t>
+      </w:r>
+    </w:p>
+    <w:p>
+      <w:pPr>
+        <w:numPr>
+          <w:ilvl w:val="0"/>
+          <w:numId w:val="1"/>
+        </w:numPr>
+        <w:rPr>
+          <w:lang w:val="en-IN"/>
+        </w:rPr>
+      </w:pPr>
+      <w:r>
+        <w:rPr>
+          <w:lang w:val="en-IN"/>
+        </w:rPr>
+        <w:t>Adequate numbers of equipment are available in the Laboratories</w:t>
+      </w:r>
+    </w:p>
+    <w:p>
+      <w:pPr>
+        <w:rPr>
+          <w:lang w:val="en-IN"/>
+        </w:rPr>
+      </w:pPr>
+      <w:r>
+        <w:rPr>
+          <w:b/>
+          <w:bCs/>
+          <w:lang w:val="en-IN"/>
+        </w:rPr>
+        <w:t>Quality of Labs/workshop</w:t>
+      </w:r>
+    </w:p>
+    <w:p>
+      <w:pPr>
+        <w:numPr>
+          <w:ilvl w:val="0"/>
+          <w:numId w:val="2"/>
+        </w:numPr>
+        <w:rPr>
+          <w:lang w:val="en-IN"/>
+        </w:rPr>
+      </w:pPr>
+      <w:r>
+        <w:rPr>
+          <w:lang w:val="en-IN"/>
+        </w:rPr>
+        <w:t>The students learn and practice the fundamentals of various fields in these laboratories.</w:t>
+      </w:r>
+    </w:p>
+    <w:p>
+      <w:pPr>
+        <w:numPr>
+          <w:ilvl w:val="0"/>
+          <w:numId w:val="2"/>
+        </w:numPr>
+        <w:rPr>
+          <w:lang w:val="en-IN"/>
+        </w:rPr>
+      </w:pPr>
+      <w:r>
+        <w:rPr>
+          <w:lang w:val="en-IN"/>
+        </w:rPr>
+        <w:t xml:space="preserve">All laboratories are well equipped with essential Civil </w:t>
+      </w:r>
+      <w:proofErr w:type="spellStart"/>
+      <w:r>
+        <w:rPr>
+          <w:lang w:val="en-IN"/>
+        </w:rPr>
+        <w:t>equipments</w:t>
+      </w:r>
+      <w:proofErr w:type="spellEnd"/>
+      <w:r>
+        <w:rPr>
+          <w:lang w:val="en-IN"/>
+        </w:rPr>
+        <w:t xml:space="preserve"> like hardware, software and instructional manuals.</w:t>
+      </w:r>
+    </w:p>
+    <w:p>
+      <w:pPr>
+        <w:numPr>
+          <w:ilvl w:val="0"/>
+          <w:numId w:val="2"/>
+        </w:numPr>
+        <w:rPr>
+          <w:lang w:val="en-IN"/>
+        </w:rPr>
+      </w:pPr>
+      <w:r>
+        <w:rPr>
+          <w:lang w:val="en-IN"/>
+        </w:rPr>
+        <w:t>The observation and record books are checked, verified and maintained.</w:t>
+      </w:r>
+    </w:p>
+    <w:p>
+      <w:pPr>
+        <w:numPr>
+          <w:ilvl w:val="0"/>
+          <w:numId w:val="2"/>
+        </w:numPr>
+        <w:rPr>
+          <w:lang w:val="en-IN"/>
+        </w:rPr>
+      </w:pPr>
+      <w:r>
+        <w:rPr>
+          <w:lang w:val="en-IN"/>
+        </w:rPr>
+        <w:t>One faculty member and one technical staff member are assigned for each lab session.</w:t>
+      </w:r>
+    </w:p>
+    <w:p>
+      <w:pPr>
+        <w:numPr>
+          <w:ilvl w:val="0"/>
+          <w:numId w:val="2"/>
+        </w:numPr>
+        <w:rPr>
+          <w:lang w:val="en-IN"/>
+        </w:rPr>
+      </w:pPr>
+      <w:r>
+        <w:rPr>
+          <w:lang w:val="en-IN"/>
+        </w:rPr>
+        <w:t xml:space="preserve">All Computers and </w:t>
+      </w:r>
+      <w:proofErr w:type="spellStart"/>
+      <w:r>
+        <w:rPr>
+          <w:lang w:val="en-IN"/>
+        </w:rPr>
+        <w:t>softwares</w:t>
+      </w:r>
+      <w:proofErr w:type="spellEnd"/>
+      <w:r>
+        <w:rPr>
+          <w:lang w:val="en-IN"/>
+        </w:rPr>
+        <w:t xml:space="preserve"> help the students to learn the Course Contents and practice sufficiently as per curriculum requirements.</w:t>
+      </w:r>
+    </w:p>
+    <w:p>
+      <w:pPr>
+        <w:numPr>
+          <w:ilvl w:val="0"/>
+          <w:numId w:val="2"/>
+        </w:numPr>
+        <w:rPr>
+          <w:lang w:val="en-IN"/>
+        </w:rPr>
+      </w:pPr>
+      <w:r>
+        <w:rPr>
+          <w:lang w:val="en-IN"/>
+        </w:rPr>
+        <w:t>Various Resource persons are invited to conduct hands-on workshops/Guest Lectures on latest trends in the industry and practice.</w:t>
+      </w:r>
+    </w:p>
+    <w:p>
+      <w:pPr>
+        <w:numPr>
+          <w:ilvl w:val="0"/>
+          <w:numId w:val="2"/>
+        </w:numPr>
+        <w:rPr>
+          <w:lang w:val="en-IN"/>
+        </w:rPr>
+      </w:pPr>
+      <w:r>
+        <w:rPr>
+          <w:lang w:val="en-IN"/>
+        </w:rPr>
+        <w:t>Computers. are provided to students on1:1ratio.</w:t>
+      </w:r>
+    </w:p>
+    <w:p>
+      <w:pPr>
+        <w:numPr>
+          <w:ilvl w:val="0"/>
+          <w:numId w:val="2"/>
+        </w:numPr>
+        <w:rPr>
+          <w:lang w:val="en-IN"/>
+        </w:rPr>
+      </w:pPr>
+      <w:r>
+        <w:rPr>
+          <w:lang w:val="en-IN"/>
+        </w:rPr>
+        <w:t>Adequate numbers of equipment are available in the Laboratories.</w:t>
+      </w:r>
+    </w:p>
+    <w:p>
+      <w:pPr>
+        <w:numPr>
+          <w:ilvl w:val="0"/>
+          <w:numId w:val="2"/>
+        </w:numPr>
+        <w:rPr>
+          <w:lang w:val="en-IN"/>
+        </w:rPr>
+      </w:pPr>
+      <w:r>
+        <w:rPr>
+          <w:lang w:val="en-IN"/>
+        </w:rPr>
+        <w:t>Each batch size is 21(21students).</w:t>
+      </w:r>
+    </w:p>
+    <w:p>
+      <w:pPr>
+        <w:numPr>
+          <w:ilvl w:val="0"/>
+          <w:numId w:val="2"/>
+        </w:numPr>
+        <w:rPr>
+          <w:lang w:val="en-IN"/>
+        </w:rPr>
+      </w:pPr>
+      <w:r>
+        <w:rPr>
+          <w:lang w:val="en-IN"/>
+        </w:rPr>
+        <w:t>The students can perform the experiments without any difficulty.</w:t>
+      </w:r>
+    </w:p>
+    <w:p>
+      <w:pPr>
+        <w:numPr>
+          <w:ilvl w:val="0"/>
+          <w:numId w:val="2"/>
+        </w:numPr>
+        <w:rPr>
+          <w:lang w:val="en-IN"/>
+        </w:rPr>
+      </w:pPr>
+      <w:r>
+        <w:rPr>
+          <w:lang w:val="en-IN"/>
+        </w:rPr>
+        <w:t>The assessment is done based on DTE curriculum and rubrics. understanding the experiment and on-time submission of laboratory records.</w:t>
+      </w:r>
+    </w:p>
+    <w:p>
+      <w:pPr>
+        <w:numPr>
+          <w:ilvl w:val="0"/>
+          <w:numId w:val="2"/>
+        </w:numPr>
+        <w:rPr>
+          <w:lang w:val="en-IN"/>
+        </w:rPr>
+      </w:pPr>
+      <w:r>
+        <w:rPr>
+          <w:lang w:val="en-IN"/>
+        </w:rPr>
+        <w:t>The requirements of consumables for laboratory are given in time so that practical s will be conducted efficiently.</w:t>
+      </w:r>
+    </w:p>
+    <w:p>
+      <w:pPr>
+        <w:numPr>
+          <w:ilvl w:val="0"/>
+          <w:numId w:val="2"/>
+        </w:numPr>
+        <w:rPr>
+          <w:lang w:val="en-IN"/>
+        </w:rPr>
+      </w:pPr>
+      <w:r>
+        <w:rPr>
+          <w:lang w:val="en-IN"/>
+        </w:rPr>
+        <w:t>Safety measures, charts are displayed in the Laboratory.</w:t>
+      </w:r>
+    </w:p>
+    <w:p>
+      <w:pPr>
+        <w:rPr>
+          <w:lang w:val="en-IN"/>
+        </w:rPr>
+      </w:pPr>
+      <w:r>
+        <w:rPr>
+          <w:b/>
+          <w:bCs/>
+          <w:lang w:val="en-IN"/>
+        </w:rPr>
+        <w:t>Safety Measures</w:t>
+      </w:r>
+    </w:p>
+    <w:p>
+      <w:pPr>
+        <w:numPr>
+          <w:ilvl w:val="0"/>
+          <w:numId w:val="3"/>
+        </w:numPr>
+        <w:rPr>
+          <w:lang w:val="en-IN"/>
+        </w:rPr>
+      </w:pPr>
+      <w:r>
+        <w:rPr>
+          <w:lang w:val="en-IN"/>
+        </w:rPr>
+        <w:t>Safety measure charts are Displayed in all labs.</w:t>
+      </w:r>
+    </w:p>
+    <w:p>
+      <w:pPr>
+        <w:numPr>
+          <w:ilvl w:val="0"/>
+          <w:numId w:val="3"/>
+        </w:numPr>
+        <w:rPr>
+          <w:lang w:val="en-IN"/>
+        </w:rPr>
+      </w:pPr>
+      <w:r>
+        <w:rPr>
+          <w:lang w:val="en-IN"/>
+        </w:rPr>
+        <w:t>Electrical Wires are protected by MCB and fuses</w:t>
+      </w:r>
+    </w:p>
+    <w:p>
+      <w:pPr>
+        <w:numPr>
+          <w:ilvl w:val="0"/>
+          <w:numId w:val="3"/>
+        </w:numPr>
+        <w:rPr>
+          <w:lang w:val="en-IN"/>
+        </w:rPr>
+      </w:pPr>
+      <w:r>
+        <w:rPr>
+          <w:lang w:val="en-IN"/>
+        </w:rPr>
+        <w:lastRenderedPageBreak/>
+        <w:t>First-aid Kit</w:t>
+      </w:r>
+    </w:p>
+    <w:p>
+      <w:pPr>
+        <w:numPr>
+          <w:ilvl w:val="0"/>
+          <w:numId w:val="3"/>
+        </w:numPr>
+        <w:rPr>
+          <w:lang w:val="en-IN"/>
+        </w:rPr>
+      </w:pPr>
+      <w:r>
+        <w:rPr>
+          <w:lang w:val="en-IN"/>
+        </w:rPr>
+        <w:t>Fire Extinguisher</w:t>
+      </w:r>
+    </w:p>
+    <w:p>
+      <w:pPr>
+        <w:numPr>
+          <w:ilvl w:val="0"/>
+          <w:numId w:val="3"/>
+        </w:numPr>
+        <w:rPr>
+          <w:lang w:val="en-IN"/>
+        </w:rPr>
+      </w:pPr>
+      <w:r>
+        <w:rPr>
+          <w:lang w:val="en-IN"/>
+        </w:rPr>
+        <w:t>Proper Earthing</w:t>
+      </w:r>
+    </w:p>
+    <w:p>
+      <w:pPr>
+        <w:numPr>
+          <w:ilvl w:val="0"/>
+          <w:numId w:val="3"/>
+        </w:numPr>
+        <w:rPr>
+          <w:lang w:val="en-IN"/>
+        </w:rPr>
+      </w:pPr>
+      <w:r>
+        <w:rPr>
+          <w:lang w:val="en-IN"/>
+        </w:rPr>
+        <w:t>CCTV Cameras</w:t>
+      </w:r>
+    </w:p>
     <w:p/>
     <w:sectPr>
       <w:pgSz w:w="12240" w:h="15840"/>
@@ -370,6 +1375,467 @@
     </w:sectPr>
   </w:body>
 </w:document>
+</file>
+
+<file path=word/numbering.xml><?xml version="1.0" encoding="utf-8"?>
+<w:numbering xmlns:wpc="http://schemas.microsoft.com/office/word/2010/wordprocessingCanvas" xmlns:cx="http://schemas.microsoft.com/office/drawing/2014/chartex" xmlns:cx1="http://schemas.microsoft.com/office/drawing/2015/9/8/chartex" xmlns:cx2="http://schemas.microsoft.com/office/drawing/2015/10/21/chartex" xmlns:cx3="http://schemas.microsoft.com/office/drawing/2016/5/9/chartex" xmlns:cx4="http://schemas.microsoft.com/office/drawing/2016/5/10/chartex" xmlns:cx5="http://schemas.microsoft.com/office/drawing/2016/5/11/chartex" xmlns:cx6="http://schemas.microsoft.com/office/drawing/2016/5/12/chartex" xmlns:cx7="http://schemas.microsoft.com/office/drawing/2016/5/13/chartex" xmlns:cx8="http://schemas.microsoft.com/office/drawing/2016/5/14/chartex" xmlns:mc="http://schemas.openxmlformats.org/markup-compatibility/2006" xmlns:aink="http://schemas.microsoft.com/office/drawing/2016/ink" xmlns:am3d="http://schemas.microsoft.com/office/drawing/2017/model3d" xmlns:o="urn:schemas-microsoft-com:office:office" xmlns:oel="http://schemas.microsoft.com/office/2019/extlst" xmlns:r="http://schemas.openxmlformats.org/officeDocument/2006/relationships" xmlns:m="http://schemas.openxmlformats.org/officeDocument/2006/math" xmlns:v="urn:schemas-microsoft-com:vml" xmlns:wp14="http://schemas.microsoft.com/office/word/2010/wordprocessingDrawing" xmlns:wp="http://schemas.openxmlformats.org/drawingml/2006/wordprocessingDrawing" xmlns:w10="urn:schemas-microsoft-com:office:word" xmlns:w="http://schemas.openxmlformats.org/wordprocessingml/2006/main" xmlns:w14="http://schemas.microsoft.com/office/word/2010/wordml" xmlns:w15="http://schemas.microsoft.com/office/word/2012/wordml" xmlns:w16cex="http://schemas.microsoft.com/office/word/2018/wordml/cex" xmlns:w16cid="http://schemas.microsoft.com/office/word/2016/wordml/cid" xmlns:w16="http://schemas.microsoft.com/office/word/2018/wordml" xmlns:w16du="http://schemas.microsoft.com/office/word/2023/wordml/word16du" xmlns:w16sdtdh="http://schemas.microsoft.com/office/word/2020/wordml/sdtdatahash" xmlns:w16se="http://schemas.microsoft.com/office/word/2015/wordml/symex" xmlns:wpg="http://schemas.microsoft.com/office/word/2010/wordprocessingGroup" xmlns:wpi="http://schemas.microsoft.com/office/word/2010/wordprocessingInk" xmlns:wne="http://schemas.microsoft.com/office/word/2006/wordml" xmlns:wps="http://schemas.microsoft.com/office/word/2010/wordprocessingShape" mc:Ignorable="w14 w15 w16se w16cid w16 w16cex w16sdtdh w16du wp14">
+  <w:abstractNum w:abstractNumId="0" w15:restartNumberingAfterBreak="0">
+    <w:nsid w:val="3D006EB1"/>
+    <w:multiLevelType w:val="multilevel"/>
+    <w:tmpl w:val="7C683064"/>
+    <w:lvl w:ilvl="0">
+      <w:start w:val="1"/>
+      <w:numFmt w:val="bullet"/>
+      <w:lvlText w:val=""/>
+      <w:lvlJc w:val="left"/>
+      <w:pPr>
+        <w:tabs>
+          <w:tab w:val="num" w:pos="720"/>
+        </w:tabs>
+        <w:ind w:left="720" w:hanging="360"/>
+      </w:pPr>
+      <w:rPr>
+        <w:rFonts w:ascii="Symbol" w:hAnsi="Symbol" w:hint="default"/>
+        <w:sz w:val="20"/>
+      </w:rPr>
+    </w:lvl>
+    <w:lvl w:ilvl="1" w:tentative="1">
+      <w:start w:val="1"/>
+      <w:numFmt w:val="bullet"/>
+      <w:lvlText w:val=""/>
+      <w:lvlJc w:val="left"/>
+      <w:pPr>
+        <w:tabs>
+          <w:tab w:val="num" w:pos="1440"/>
+        </w:tabs>
+        <w:ind w:left="1440" w:hanging="360"/>
+      </w:pPr>
+      <w:rPr>
+        <w:rFonts w:ascii="Symbol" w:hAnsi="Symbol" w:hint="default"/>
+        <w:sz w:val="20"/>
+      </w:rPr>
+    </w:lvl>
+    <w:lvl w:ilvl="2" w:tentative="1">
+      <w:start w:val="1"/>
+      <w:numFmt w:val="bullet"/>
+      <w:lvlText w:val=""/>
+      <w:lvlJc w:val="left"/>
+      <w:pPr>
+        <w:tabs>
+          <w:tab w:val="num" w:pos="2160"/>
+        </w:tabs>
+        <w:ind w:left="2160" w:hanging="360"/>
+      </w:pPr>
+      <w:rPr>
+        <w:rFonts w:ascii="Symbol" w:hAnsi="Symbol" w:hint="default"/>
+        <w:sz w:val="20"/>
+      </w:rPr>
+    </w:lvl>
+    <w:lvl w:ilvl="3" w:tentative="1">
+      <w:start w:val="1"/>
+      <w:numFmt w:val="bullet"/>
+      <w:lvlText w:val=""/>
+      <w:lvlJc w:val="left"/>
+      <w:pPr>
+        <w:tabs>
+          <w:tab w:val="num" w:pos="2880"/>
+        </w:tabs>
+        <w:ind w:left="2880" w:hanging="360"/>
+      </w:pPr>
+      <w:rPr>
+        <w:rFonts w:ascii="Symbol" w:hAnsi="Symbol" w:hint="default"/>
+        <w:sz w:val="20"/>
+      </w:rPr>
+    </w:lvl>
+    <w:lvl w:ilvl="4" w:tentative="1">
+      <w:start w:val="1"/>
+      <w:numFmt w:val="bullet"/>
+      <w:lvlText w:val=""/>
+      <w:lvlJc w:val="left"/>
+      <w:pPr>
+        <w:tabs>
+          <w:tab w:val="num" w:pos="3600"/>
+        </w:tabs>
+        <w:ind w:left="3600" w:hanging="360"/>
+      </w:pPr>
+      <w:rPr>
+        <w:rFonts w:ascii="Symbol" w:hAnsi="Symbol" w:hint="default"/>
+        <w:sz w:val="20"/>
+      </w:rPr>
+    </w:lvl>
+    <w:lvl w:ilvl="5" w:tentative="1">
+      <w:start w:val="1"/>
+      <w:numFmt w:val="bullet"/>
+      <w:lvlText w:val=""/>
+      <w:lvlJc w:val="left"/>
+      <w:pPr>
+        <w:tabs>
+          <w:tab w:val="num" w:pos="4320"/>
+        </w:tabs>
+        <w:ind w:left="4320" w:hanging="360"/>
+      </w:pPr>
+      <w:rPr>
+        <w:rFonts w:ascii="Symbol" w:hAnsi="Symbol" w:hint="default"/>
+        <w:sz w:val="20"/>
+      </w:rPr>
+    </w:lvl>
+    <w:lvl w:ilvl="6" w:tentative="1">
+      <w:start w:val="1"/>
+      <w:numFmt w:val="bullet"/>
+      <w:lvlText w:val=""/>
+      <w:lvlJc w:val="left"/>
+      <w:pPr>
+        <w:tabs>
+          <w:tab w:val="num" w:pos="5040"/>
+        </w:tabs>
+        <w:ind w:left="5040" w:hanging="360"/>
+      </w:pPr>
+      <w:rPr>
+        <w:rFonts w:ascii="Symbol" w:hAnsi="Symbol" w:hint="default"/>
+        <w:sz w:val="20"/>
+      </w:rPr>
+    </w:lvl>
+    <w:lvl w:ilvl="7" w:tentative="1">
+      <w:start w:val="1"/>
+      <w:numFmt w:val="bullet"/>
+      <w:lvlText w:val=""/>
+      <w:lvlJc w:val="left"/>
+      <w:pPr>
+        <w:tabs>
+          <w:tab w:val="num" w:pos="5760"/>
+        </w:tabs>
+        <w:ind w:left="5760" w:hanging="360"/>
+      </w:pPr>
+      <w:rPr>
+        <w:rFonts w:ascii="Symbol" w:hAnsi="Symbol" w:hint="default"/>
+        <w:sz w:val="20"/>
+      </w:rPr>
+    </w:lvl>
+    <w:lvl w:ilvl="8" w:tentative="1">
+      <w:start w:val="1"/>
+      <w:numFmt w:val="bullet"/>
+      <w:lvlText w:val=""/>
+      <w:lvlJc w:val="left"/>
+      <w:pPr>
+        <w:tabs>
+          <w:tab w:val="num" w:pos="6480"/>
+        </w:tabs>
+        <w:ind w:left="6480" w:hanging="360"/>
+      </w:pPr>
+      <w:rPr>
+        <w:rFonts w:ascii="Symbol" w:hAnsi="Symbol" w:hint="default"/>
+        <w:sz w:val="20"/>
+      </w:rPr>
+    </w:lvl>
+  </w:abstractNum>
+  <w:abstractNum w:abstractNumId="1" w15:restartNumberingAfterBreak="0">
+    <w:nsid w:val="4F7614F8"/>
+    <w:multiLevelType w:val="multilevel"/>
+    <w:tmpl w:val="6B2C0618"/>
+    <w:lvl w:ilvl="0">
+      <w:start w:val="1"/>
+      <w:numFmt w:val="bullet"/>
+      <w:lvlText w:val=""/>
+      <w:lvlJc w:val="left"/>
+      <w:pPr>
+        <w:tabs>
+          <w:tab w:val="num" w:pos="720"/>
+        </w:tabs>
+        <w:ind w:left="720" w:hanging="360"/>
+      </w:pPr>
+      <w:rPr>
+        <w:rFonts w:ascii="Symbol" w:hAnsi="Symbol" w:hint="default"/>
+        <w:sz w:val="20"/>
+      </w:rPr>
+    </w:lvl>
+    <w:lvl w:ilvl="1" w:tentative="1">
+      <w:start w:val="1"/>
+      <w:numFmt w:val="bullet"/>
+      <w:lvlText w:val=""/>
+      <w:lvlJc w:val="left"/>
+      <w:pPr>
+        <w:tabs>
+          <w:tab w:val="num" w:pos="1440"/>
+        </w:tabs>
+        <w:ind w:left="1440" w:hanging="360"/>
+      </w:pPr>
+      <w:rPr>
+        <w:rFonts w:ascii="Symbol" w:hAnsi="Symbol" w:hint="default"/>
+        <w:sz w:val="20"/>
+      </w:rPr>
+    </w:lvl>
+    <w:lvl w:ilvl="2" w:tentative="1">
+      <w:start w:val="1"/>
+      <w:numFmt w:val="bullet"/>
+      <w:lvlText w:val=""/>
+      <w:lvlJc w:val="left"/>
+      <w:pPr>
+        <w:tabs>
+          <w:tab w:val="num" w:pos="2160"/>
+        </w:tabs>
+        <w:ind w:left="2160" w:hanging="360"/>
+      </w:pPr>
+      <w:rPr>
+        <w:rFonts w:ascii="Symbol" w:hAnsi="Symbol" w:hint="default"/>
+        <w:sz w:val="20"/>
+      </w:rPr>
+    </w:lvl>
+    <w:lvl w:ilvl="3" w:tentative="1">
+      <w:start w:val="1"/>
+      <w:numFmt w:val="bullet"/>
+      <w:lvlText w:val=""/>
+      <w:lvlJc w:val="left"/>
+      <w:pPr>
+        <w:tabs>
+          <w:tab w:val="num" w:pos="2880"/>
+        </w:tabs>
+        <w:ind w:left="2880" w:hanging="360"/>
+      </w:pPr>
+      <w:rPr>
+        <w:rFonts w:ascii="Symbol" w:hAnsi="Symbol" w:hint="default"/>
+        <w:sz w:val="20"/>
+      </w:rPr>
+    </w:lvl>
+    <w:lvl w:ilvl="4" w:tentative="1">
+      <w:start w:val="1"/>
+      <w:numFmt w:val="bullet"/>
+      <w:lvlText w:val=""/>
+      <w:lvlJc w:val="left"/>
+      <w:pPr>
+        <w:tabs>
+          <w:tab w:val="num" w:pos="3600"/>
+        </w:tabs>
+        <w:ind w:left="3600" w:hanging="360"/>
+      </w:pPr>
+      <w:rPr>
+        <w:rFonts w:ascii="Symbol" w:hAnsi="Symbol" w:hint="default"/>
+        <w:sz w:val="20"/>
+      </w:rPr>
+    </w:lvl>
+    <w:lvl w:ilvl="5" w:tentative="1">
+      <w:start w:val="1"/>
+      <w:numFmt w:val="bullet"/>
+      <w:lvlText w:val=""/>
+      <w:lvlJc w:val="left"/>
+      <w:pPr>
+        <w:tabs>
+          <w:tab w:val="num" w:pos="4320"/>
+        </w:tabs>
+        <w:ind w:left="4320" w:hanging="360"/>
+      </w:pPr>
+      <w:rPr>
+        <w:rFonts w:ascii="Symbol" w:hAnsi="Symbol" w:hint="default"/>
+        <w:sz w:val="20"/>
+      </w:rPr>
+    </w:lvl>
+    <w:lvl w:ilvl="6" w:tentative="1">
+      <w:start w:val="1"/>
+      <w:numFmt w:val="bullet"/>
+      <w:lvlText w:val=""/>
+      <w:lvlJc w:val="left"/>
+      <w:pPr>
+        <w:tabs>
+          <w:tab w:val="num" w:pos="5040"/>
+        </w:tabs>
+        <w:ind w:left="5040" w:hanging="360"/>
+      </w:pPr>
+      <w:rPr>
+        <w:rFonts w:ascii="Symbol" w:hAnsi="Symbol" w:hint="default"/>
+        <w:sz w:val="20"/>
+      </w:rPr>
+    </w:lvl>
+    <w:lvl w:ilvl="7" w:tentative="1">
+      <w:start w:val="1"/>
+      <w:numFmt w:val="bullet"/>
+      <w:lvlText w:val=""/>
+      <w:lvlJc w:val="left"/>
+      <w:pPr>
+        <w:tabs>
+          <w:tab w:val="num" w:pos="5760"/>
+        </w:tabs>
+        <w:ind w:left="5760" w:hanging="360"/>
+      </w:pPr>
+      <w:rPr>
+        <w:rFonts w:ascii="Symbol" w:hAnsi="Symbol" w:hint="default"/>
+        <w:sz w:val="20"/>
+      </w:rPr>
+    </w:lvl>
+    <w:lvl w:ilvl="8" w:tentative="1">
+      <w:start w:val="1"/>
+      <w:numFmt w:val="bullet"/>
+      <w:lvlText w:val=""/>
+      <w:lvlJc w:val="left"/>
+      <w:pPr>
+        <w:tabs>
+          <w:tab w:val="num" w:pos="6480"/>
+        </w:tabs>
+        <w:ind w:left="6480" w:hanging="360"/>
+      </w:pPr>
+      <w:rPr>
+        <w:rFonts w:ascii="Symbol" w:hAnsi="Symbol" w:hint="default"/>
+        <w:sz w:val="20"/>
+      </w:rPr>
+    </w:lvl>
+  </w:abstractNum>
+  <w:abstractNum w:abstractNumId="2" w15:restartNumberingAfterBreak="0">
+    <w:nsid w:val="7658508E"/>
+    <w:multiLevelType w:val="multilevel"/>
+    <w:tmpl w:val="523E79AA"/>
+    <w:lvl w:ilvl="0">
+      <w:start w:val="1"/>
+      <w:numFmt w:val="bullet"/>
+      <w:lvlText w:val=""/>
+      <w:lvlJc w:val="left"/>
+      <w:pPr>
+        <w:tabs>
+          <w:tab w:val="num" w:pos="720"/>
+        </w:tabs>
+        <w:ind w:left="720" w:hanging="360"/>
+      </w:pPr>
+      <w:rPr>
+        <w:rFonts w:ascii="Symbol" w:hAnsi="Symbol" w:hint="default"/>
+        <w:sz w:val="20"/>
+      </w:rPr>
+    </w:lvl>
+    <w:lvl w:ilvl="1" w:tentative="1">
+      <w:start w:val="1"/>
+      <w:numFmt w:val="bullet"/>
+      <w:lvlText w:val=""/>
+      <w:lvlJc w:val="left"/>
+      <w:pPr>
+        <w:tabs>
+          <w:tab w:val="num" w:pos="1440"/>
+        </w:tabs>
+        <w:ind w:left="1440" w:hanging="360"/>
+      </w:pPr>
+      <w:rPr>
+        <w:rFonts w:ascii="Symbol" w:hAnsi="Symbol" w:hint="default"/>
+        <w:sz w:val="20"/>
+      </w:rPr>
+    </w:lvl>
+    <w:lvl w:ilvl="2" w:tentative="1">
+      <w:start w:val="1"/>
+      <w:numFmt w:val="bullet"/>
+      <w:lvlText w:val=""/>
+      <w:lvlJc w:val="left"/>
+      <w:pPr>
+        <w:tabs>
+          <w:tab w:val="num" w:pos="2160"/>
+        </w:tabs>
+        <w:ind w:left="2160" w:hanging="360"/>
+      </w:pPr>
+      <w:rPr>
+        <w:rFonts w:ascii="Symbol" w:hAnsi="Symbol" w:hint="default"/>
+        <w:sz w:val="20"/>
+      </w:rPr>
+    </w:lvl>
+    <w:lvl w:ilvl="3" w:tentative="1">
+      <w:start w:val="1"/>
+      <w:numFmt w:val="bullet"/>
+      <w:lvlText w:val=""/>
+      <w:lvlJc w:val="left"/>
+      <w:pPr>
+        <w:tabs>
+          <w:tab w:val="num" w:pos="2880"/>
+        </w:tabs>
+        <w:ind w:left="2880" w:hanging="360"/>
+      </w:pPr>
+      <w:rPr>
+        <w:rFonts w:ascii="Symbol" w:hAnsi="Symbol" w:hint="default"/>
+        <w:sz w:val="20"/>
+      </w:rPr>
+    </w:lvl>
+    <w:lvl w:ilvl="4" w:tentative="1">
+      <w:start w:val="1"/>
+      <w:numFmt w:val="bullet"/>
+      <w:lvlText w:val=""/>
+      <w:lvlJc w:val="left"/>
+      <w:pPr>
+        <w:tabs>
+          <w:tab w:val="num" w:pos="3600"/>
+        </w:tabs>
+        <w:ind w:left="3600" w:hanging="360"/>
+      </w:pPr>
+      <w:rPr>
+        <w:rFonts w:ascii="Symbol" w:hAnsi="Symbol" w:hint="default"/>
+        <w:sz w:val="20"/>
+      </w:rPr>
+    </w:lvl>
+    <w:lvl w:ilvl="5" w:tentative="1">
+      <w:start w:val="1"/>
+      <w:numFmt w:val="bullet"/>
+      <w:lvlText w:val=""/>
+      <w:lvlJc w:val="left"/>
+      <w:pPr>
+        <w:tabs>
+          <w:tab w:val="num" w:pos="4320"/>
+        </w:tabs>
+        <w:ind w:left="4320" w:hanging="360"/>
+      </w:pPr>
+      <w:rPr>
+        <w:rFonts w:ascii="Symbol" w:hAnsi="Symbol" w:hint="default"/>
+        <w:sz w:val="20"/>
+      </w:rPr>
+    </w:lvl>
+    <w:lvl w:ilvl="6" w:tentative="1">
+      <w:start w:val="1"/>
+      <w:numFmt w:val="bullet"/>
+      <w:lvlText w:val=""/>
+      <w:lvlJc w:val="left"/>
+      <w:pPr>
+        <w:tabs>
+          <w:tab w:val="num" w:pos="5040"/>
+        </w:tabs>
+        <w:ind w:left="5040" w:hanging="360"/>
+      </w:pPr>
+      <w:rPr>
+        <w:rFonts w:ascii="Symbol" w:hAnsi="Symbol" w:hint="default"/>
+        <w:sz w:val="20"/>
+      </w:rPr>
+    </w:lvl>
+    <w:lvl w:ilvl="7" w:tentative="1">
+      <w:start w:val="1"/>
+      <w:numFmt w:val="bullet"/>
+      <w:lvlText w:val=""/>
+      <w:lvlJc w:val="left"/>
+      <w:pPr>
+        <w:tabs>
+          <w:tab w:val="num" w:pos="5760"/>
+        </w:tabs>
+        <w:ind w:left="5760" w:hanging="360"/>
+      </w:pPr>
+      <w:rPr>
+        <w:rFonts w:ascii="Symbol" w:hAnsi="Symbol" w:hint="default"/>
+        <w:sz w:val="20"/>
+      </w:rPr>
+    </w:lvl>
+    <w:lvl w:ilvl="8" w:tentative="1">
+      <w:start w:val="1"/>
+      <w:numFmt w:val="bullet"/>
+      <w:lvlText w:val=""/>
+      <w:lvlJc w:val="left"/>
+      <w:pPr>
+        <w:tabs>
+          <w:tab w:val="num" w:pos="6480"/>
+        </w:tabs>
+        <w:ind w:left="6480" w:hanging="360"/>
+      </w:pPr>
+      <w:rPr>
+        <w:rFonts w:ascii="Symbol" w:hAnsi="Symbol" w:hint="default"/>
+        <w:sz w:val="20"/>
+      </w:rPr>
+    </w:lvl>
+  </w:abstractNum>
+  <w:num w:numId="1" w16cid:durableId="2104916291">
+    <w:abstractNumId w:val="2"/>
+  </w:num>
+  <w:num w:numId="2" w16cid:durableId="29229637">
+    <w:abstractNumId w:val="1"/>
+  </w:num>
+  <w:num w:numId="3" w16cid:durableId="2084987595">
+    <w:abstractNumId w:val="0"/>
+  </w:num>
+</w:numbering>
 </file>
 
 <file path=word/styles.xml><?xml version="1.0" encoding="utf-8"?>

</xml_diff>